<commit_message>
PPEECS paper: humanization sweep of paper and supplement
Every paragraph paraphrased for natural, varied prose. The abstract now
carries the whole story and names the system (Data Drift Autopsy); the
introduction presents the pipeline and its novelty before the method.
Abbreviations are defined at first use, tables and figures sit where they
enter the narrative with their explanation after them, and Discussion and
Conclusions are merged. Numbers, citations and claims are unchanged.

Co-Authored-By: Claude Opus 5.5 <noreply@anthropic.com>
Claude-Session: https://claude.ai/code/session_01Q2jh3ncUT27YtGPEiV2BVS
</commit_message>
<xml_diff>
--- a/ppeecs/build/PPEECS_supplement.docx
+++ b/ppeecs/build/PPEECS_supplement.docx
@@ -146,7 +146,7 @@
         <w:ind w:firstLine="0"/>
       </w:pPr>
       <w:r>
-        <w:t xml:space="preserve">This supplement gives four pieces of detail that support the main paper: how the size of the delayed audit affects the diagnosis, the remediation triage in every real setting, the mapping of the ACS relationship codes across the 2019 redesign and the dashboard through which the pipeline reports its results.</w:t>
+        <w:t xml:space="preserve">This supplement adds four pieces of detail to the main paper. It shows how the size of the delayed audit affects the diagnosis, reports the remediation triage for every real setting, lists how the relationship codes of the American Community Survey (ACS) were matched across their 2019 redesign and shows the dashboard through which the pipeline reports its results.</w:t>
       </w:r>
     </w:p>
     <w:p>
@@ -170,13 +170,13 @@
         <w:t xml:space="preserve">3.3</w:t>
       </w:r>
       <w:r>
-        <w:t xml:space="preserve"> separates concept drift from label noise with a few hundred late labels. The paper uses 600 labels throughout. Fig. </w:t>
+        <w:t xml:space="preserve"> needs late labels. Labels cost money, so it matters how many are enough. The paper uses 600 labels throughout. Fig. </w:t>
       </w:r>
       <w:r>
         <w:t xml:space="preserve">S1</w:t>
       </w:r>
       <w:r>
-        <w:t xml:space="preserve"> shows how the share of correctly diagnosed windows changes with the number of audit labels on ACS Income design A with logistic regression (LR).</w:t>
+        <w:t xml:space="preserve"> shows how the share of correctly diagnosed windows changes with the size of the audit on ACS Income design A with logistic regression (LR).</w:t>
       </w:r>
     </w:p>
     <w:p>
@@ -246,7 +246,7 @@
         <w:pStyle w:val="PPBodyMainText"/>
       </w:pPr>
       <w:r>
-        <w:t xml:space="preserve">Concept drift is identified in 80% of windows with 200 labels and 95% with 600, while label noise is identified in 79% and 87%. With 1,000 labels neither rate rises much further (96% and 82%), so the 600 labels used in the paper lie where the gain from more labels has largely flattened. The control windows are diagnosed correctly in the same share of cases at every audit size.</w:t>
+        <w:t xml:space="preserve">With 200 labels, concept drift is identified in 80% of windows and label noise in 79%. With 600 labels the two rates reach 95% and 87%. Going on to 1,000 labels adds little (96% and 82%). The 600 labels of the paper therefore sit where more labels stop paying off. The control windows are diagnosed correctly in the same share of cases at every audit size.</w:t>
       </w:r>
     </w:p>
     <w:p>
@@ -271,7 +271,7 @@
         <w:t xml:space="preserve">5.5</w:t>
       </w:r>
       <w:r>
-        <w:t xml:space="preserve"> summarizes how often the triage of Section </w:t>
+        <w:t xml:space="preserve"> of the paper summarizes how often the triage of Section </w:t>
       </w:r>
       <w:r>
         <w:t xml:space="preserve">3.5</w:t>
@@ -283,7 +283,7 @@
         <w:t xml:space="preserve">S1</w:t>
       </w:r>
       <w:r>
-        <w:t xml:space="preserve"> shows the result for every real setting and both model families.</w:t>
+        <w:t xml:space="preserve"> breaks this summary down by real setting and model family, so that the source of each right or wrong verdict can be seen.</w:t>
       </w:r>
     </w:p>
     <w:p>
@@ -312,21 +312,21 @@
         <w:jc w:val="center"/>
         <w:tblLayout w:type="fixed"/>
         <w:tblCellMar>
-          <w:left w:w="45" w:type="dxa"/>
-          <w:right w:w="45" w:type="dxa"/>
+          <w:left w:w="30" w:type="dxa"/>
+          <w:right w:w="30" w:type="dxa"/>
         </w:tblCellMar>
         <w:tblLook w:val="04A0" w:firstRow="1" w:lastRow="0" w:firstColumn="1" w:lastColumn="0" w:noHBand="0" w:noVBand="1"/>
       </w:tblPr>
       <w:tblGrid>
-        <w:gridCol w:w="537"/>
-        <w:gridCol w:w="1946"/>
-        <w:gridCol w:w="300"/>
-        <w:gridCol w:w="324"/>
-        <w:gridCol w:w="564"/>
-        <w:gridCol w:w="546"/>
-        <w:gridCol w:w="733"/>
-        <w:gridCol w:w="847"/>
-        <w:gridCol w:w="599"/>
+        <w:gridCol w:w="523"/>
+        <w:gridCol w:w="2044"/>
+        <w:gridCol w:w="200"/>
+        <w:gridCol w:w="292"/>
+        <w:gridCol w:w="551"/>
+        <w:gridCol w:w="532"/>
+        <w:gridCol w:w="734"/>
+        <w:gridCol w:w="857"/>
+        <w:gridCol w:w="590"/>
       </w:tblGrid>
       <w:tr>
         <w:trPr>
@@ -335,7 +335,7 @@
         </w:trPr>
         <w:tc>
           <w:tcPr>
-            <w:tcW w:w="537" w:type="dxa"/>
+            <w:tcW w:w="523" w:type="dxa"/>
             <w:tcBorders>
               <w:top w:val="single" w:sz="8" w:space="0" w:color="auto"/>
             </w:tcBorders>
@@ -352,7 +352,7 @@
         </w:tc>
         <w:tc>
           <w:tcPr>
-            <w:tcW w:w="1946" w:type="dxa"/>
+            <w:tcW w:w="2044" w:type="dxa"/>
             <w:tcBorders>
               <w:top w:val="single" w:sz="8" w:space="0" w:color="auto"/>
             </w:tcBorders>
@@ -369,7 +369,7 @@
         </w:tc>
         <w:tc>
           <w:tcPr>
-            <w:tcW w:w="300" w:type="dxa"/>
+            <w:tcW w:w="200" w:type="dxa"/>
             <w:tcBorders>
               <w:top w:val="single" w:sz="8" w:space="0" w:color="auto"/>
             </w:tcBorders>
@@ -386,7 +386,7 @@
         </w:tc>
         <w:tc>
           <w:tcPr>
-            <w:tcW w:w="1434" w:type="dxa"/>
+            <w:tcW w:w="1375" w:type="dxa"/>
             <w:gridSpan w:val="3"/>
             <w:tcBorders>
               <w:top w:val="single" w:sz="8" w:space="0" w:color="auto"/>
@@ -408,7 +408,7 @@
         </w:tc>
         <w:tc>
           <w:tcPr>
-            <w:tcW w:w="2179" w:type="dxa"/>
+            <w:tcW w:w="2181" w:type="dxa"/>
             <w:gridSpan w:val="3"/>
             <w:tcBorders>
               <w:top w:val="single" w:sz="8" w:space="0" w:color="auto"/>
@@ -436,7 +436,7 @@
         </w:trPr>
         <w:tc>
           <w:tcPr>
-            <w:tcW w:w="537" w:type="dxa"/>
+            <w:tcW w:w="523" w:type="dxa"/>
             <w:tcBorders/>
             <w:vAlign w:val="center"/>
           </w:tcPr>
@@ -454,7 +454,7 @@
         </w:tc>
         <w:tc>
           <w:tcPr>
-            <w:tcW w:w="1946" w:type="dxa"/>
+            <w:tcW w:w="2044" w:type="dxa"/>
             <w:tcBorders/>
             <w:vAlign w:val="center"/>
           </w:tcPr>
@@ -472,7 +472,7 @@
         </w:tc>
         <w:tc>
           <w:tcPr>
-            <w:tcW w:w="300" w:type="dxa"/>
+            <w:tcW w:w="200" w:type="dxa"/>
             <w:tcBorders/>
             <w:vAlign w:val="center"/>
           </w:tcPr>
@@ -492,7 +492,7 @@
         </w:tc>
         <w:tc>
           <w:tcPr>
-            <w:tcW w:w="324" w:type="dxa"/>
+            <w:tcW w:w="292" w:type="dxa"/>
             <w:tcBorders/>
             <w:vAlign w:val="center"/>
           </w:tcPr>
@@ -510,7 +510,7 @@
         </w:tc>
         <w:tc>
           <w:tcPr>
-            <w:tcW w:w="564" w:type="dxa"/>
+            <w:tcW w:w="551" w:type="dxa"/>
             <w:tcBorders/>
             <w:vAlign w:val="center"/>
           </w:tcPr>
@@ -528,7 +528,7 @@
         </w:tc>
         <w:tc>
           <w:tcPr>
-            <w:tcW w:w="546" w:type="dxa"/>
+            <w:tcW w:w="532" w:type="dxa"/>
             <w:tcBorders/>
             <w:vAlign w:val="center"/>
           </w:tcPr>
@@ -546,7 +546,7 @@
         </w:tc>
         <w:tc>
           <w:tcPr>
-            <w:tcW w:w="733" w:type="dxa"/>
+            <w:tcW w:w="734" w:type="dxa"/>
             <w:tcBorders/>
             <w:vAlign w:val="center"/>
           </w:tcPr>
@@ -564,7 +564,7 @@
         </w:tc>
         <w:tc>
           <w:tcPr>
-            <w:tcW w:w="847" w:type="dxa"/>
+            <w:tcW w:w="857" w:type="dxa"/>
             <w:tcBorders/>
             <w:vAlign w:val="center"/>
           </w:tcPr>
@@ -582,7 +582,7 @@
         </w:tc>
         <w:tc>
           <w:tcPr>
-            <w:tcW w:w="599" w:type="dxa"/>
+            <w:tcW w:w="590" w:type="dxa"/>
             <w:tcBorders/>
             <w:vAlign w:val="center"/>
           </w:tcPr>
@@ -605,7 +605,7 @@
         </w:trPr>
         <w:tc>
           <w:tcPr>
-            <w:tcW w:w="537" w:type="dxa"/>
+            <w:tcW w:w="523" w:type="dxa"/>
             <w:tcBorders>
               <w:top w:val="single" w:sz="4" w:space="0" w:color="auto"/>
             </w:tcBorders>
@@ -625,7 +625,7 @@
         </w:tc>
         <w:tc>
           <w:tcPr>
-            <w:tcW w:w="1946" w:type="dxa"/>
+            <w:tcW w:w="2044" w:type="dxa"/>
             <w:tcBorders>
               <w:top w:val="single" w:sz="4" w:space="0" w:color="auto"/>
             </w:tcBorders>
@@ -645,7 +645,7 @@
         </w:tc>
         <w:tc>
           <w:tcPr>
-            <w:tcW w:w="300" w:type="dxa"/>
+            <w:tcW w:w="200" w:type="dxa"/>
             <w:tcBorders>
               <w:top w:val="single" w:sz="4" w:space="0" w:color="auto"/>
             </w:tcBorders>
@@ -665,7 +665,7 @@
         </w:tc>
         <w:tc>
           <w:tcPr>
-            <w:tcW w:w="324" w:type="dxa"/>
+            <w:tcW w:w="292" w:type="dxa"/>
             <w:tcBorders>
               <w:top w:val="single" w:sz="4" w:space="0" w:color="auto"/>
             </w:tcBorders>
@@ -685,7 +685,7 @@
         </w:tc>
         <w:tc>
           <w:tcPr>
-            <w:tcW w:w="564" w:type="dxa"/>
+            <w:tcW w:w="551" w:type="dxa"/>
             <w:tcBorders>
               <w:top w:val="single" w:sz="4" w:space="0" w:color="auto"/>
             </w:tcBorders>
@@ -705,7 +705,7 @@
         </w:tc>
         <w:tc>
           <w:tcPr>
-            <w:tcW w:w="546" w:type="dxa"/>
+            <w:tcW w:w="532" w:type="dxa"/>
             <w:tcBorders>
               <w:top w:val="single" w:sz="4" w:space="0" w:color="auto"/>
             </w:tcBorders>
@@ -725,7 +725,7 @@
         </w:tc>
         <w:tc>
           <w:tcPr>
-            <w:tcW w:w="733" w:type="dxa"/>
+            <w:tcW w:w="734" w:type="dxa"/>
             <w:tcBorders>
               <w:top w:val="single" w:sz="4" w:space="0" w:color="auto"/>
             </w:tcBorders>
@@ -745,7 +745,7 @@
         </w:tc>
         <w:tc>
           <w:tcPr>
-            <w:tcW w:w="847" w:type="dxa"/>
+            <w:tcW w:w="857" w:type="dxa"/>
             <w:tcBorders>
               <w:top w:val="single" w:sz="4" w:space="0" w:color="auto"/>
             </w:tcBorders>
@@ -765,7 +765,7 @@
         </w:tc>
         <w:tc>
           <w:tcPr>
-            <w:tcW w:w="599" w:type="dxa"/>
+            <w:tcW w:w="590" w:type="dxa"/>
             <w:tcBorders>
               <w:top w:val="single" w:sz="4" w:space="0" w:color="auto"/>
             </w:tcBorders>
@@ -790,22 +790,22 @@
         </w:trPr>
         <w:tc>
           <w:tcPr>
-            <w:tcW w:w="537" w:type="dxa"/>
-            <w:tcBorders/>
-            <w:vAlign w:val="center"/>
-          </w:tcPr>
-          <w:p>
-            <w:pPr>
-              <w:pStyle w:val="PPTableBody"/>
-              <w:keepNext/>
-              <w:spacing w:before="10" w:after="10"/>
-              <w:jc w:val="left"/>
-            </w:pPr>
-          </w:p>
-        </w:tc>
-        <w:tc>
-          <w:tcPr>
-            <w:tcW w:w="1946" w:type="dxa"/>
+            <w:tcW w:w="523" w:type="dxa"/>
+            <w:tcBorders/>
+            <w:vAlign w:val="center"/>
+          </w:tcPr>
+          <w:p>
+            <w:pPr>
+              <w:pStyle w:val="PPTableBody"/>
+              <w:keepNext/>
+              <w:spacing w:before="10" w:after="10"/>
+              <w:jc w:val="left"/>
+            </w:pPr>
+          </w:p>
+        </w:tc>
+        <w:tc>
+          <w:tcPr>
+            <w:tcW w:w="2044" w:type="dxa"/>
             <w:tcBorders/>
             <w:vAlign w:val="center"/>
           </w:tcPr>
@@ -823,7 +823,7 @@
         </w:tc>
         <w:tc>
           <w:tcPr>
-            <w:tcW w:w="300" w:type="dxa"/>
+            <w:tcW w:w="200" w:type="dxa"/>
             <w:tcBorders/>
             <w:vAlign w:val="center"/>
           </w:tcPr>
@@ -841,7 +841,7 @@
         </w:tc>
         <w:tc>
           <w:tcPr>
-            <w:tcW w:w="324" w:type="dxa"/>
+            <w:tcW w:w="292" w:type="dxa"/>
             <w:tcBorders/>
             <w:vAlign w:val="center"/>
           </w:tcPr>
@@ -859,7 +859,7 @@
         </w:tc>
         <w:tc>
           <w:tcPr>
-            <w:tcW w:w="564" w:type="dxa"/>
+            <w:tcW w:w="551" w:type="dxa"/>
             <w:tcBorders/>
             <w:vAlign w:val="center"/>
           </w:tcPr>
@@ -877,7 +877,7 @@
         </w:tc>
         <w:tc>
           <w:tcPr>
-            <w:tcW w:w="546" w:type="dxa"/>
+            <w:tcW w:w="532" w:type="dxa"/>
             <w:tcBorders/>
             <w:vAlign w:val="center"/>
           </w:tcPr>
@@ -895,7 +895,7 @@
         </w:tc>
         <w:tc>
           <w:tcPr>
-            <w:tcW w:w="733" w:type="dxa"/>
+            <w:tcW w:w="734" w:type="dxa"/>
             <w:tcBorders/>
             <w:vAlign w:val="center"/>
           </w:tcPr>
@@ -913,7 +913,7 @@
         </w:tc>
         <w:tc>
           <w:tcPr>
-            <w:tcW w:w="847" w:type="dxa"/>
+            <w:tcW w:w="857" w:type="dxa"/>
             <w:tcBorders/>
             <w:vAlign w:val="center"/>
           </w:tcPr>
@@ -931,7 +931,7 @@
         </w:tc>
         <w:tc>
           <w:tcPr>
-            <w:tcW w:w="599" w:type="dxa"/>
+            <w:tcW w:w="590" w:type="dxa"/>
             <w:tcBorders/>
             <w:vAlign w:val="center"/>
           </w:tcPr>
@@ -954,22 +954,22 @@
         </w:trPr>
         <w:tc>
           <w:tcPr>
-            <w:tcW w:w="537" w:type="dxa"/>
-            <w:tcBorders/>
-            <w:vAlign w:val="center"/>
-          </w:tcPr>
-          <w:p>
-            <w:pPr>
-              <w:pStyle w:val="PPTableBody"/>
-              <w:keepNext/>
-              <w:spacing w:before="10" w:after="10"/>
-              <w:jc w:val="left"/>
-            </w:pPr>
-          </w:p>
-        </w:tc>
-        <w:tc>
-          <w:tcPr>
-            <w:tcW w:w="1946" w:type="dxa"/>
+            <w:tcW w:w="523" w:type="dxa"/>
+            <w:tcBorders/>
+            <w:vAlign w:val="center"/>
+          </w:tcPr>
+          <w:p>
+            <w:pPr>
+              <w:pStyle w:val="PPTableBody"/>
+              <w:keepNext/>
+              <w:spacing w:before="10" w:after="10"/>
+              <w:jc w:val="left"/>
+            </w:pPr>
+          </w:p>
+        </w:tc>
+        <w:tc>
+          <w:tcPr>
+            <w:tcW w:w="2044" w:type="dxa"/>
             <w:tcBorders/>
             <w:vAlign w:val="center"/>
           </w:tcPr>
@@ -987,7 +987,7 @@
         </w:tc>
         <w:tc>
           <w:tcPr>
-            <w:tcW w:w="300" w:type="dxa"/>
+            <w:tcW w:w="200" w:type="dxa"/>
             <w:tcBorders/>
             <w:vAlign w:val="center"/>
           </w:tcPr>
@@ -1005,7 +1005,7 @@
         </w:tc>
         <w:tc>
           <w:tcPr>
-            <w:tcW w:w="324" w:type="dxa"/>
+            <w:tcW w:w="292" w:type="dxa"/>
             <w:tcBorders/>
             <w:vAlign w:val="center"/>
           </w:tcPr>
@@ -1023,7 +1023,7 @@
         </w:tc>
         <w:tc>
           <w:tcPr>
-            <w:tcW w:w="564" w:type="dxa"/>
+            <w:tcW w:w="551" w:type="dxa"/>
             <w:tcBorders/>
             <w:vAlign w:val="center"/>
           </w:tcPr>
@@ -1041,7 +1041,7 @@
         </w:tc>
         <w:tc>
           <w:tcPr>
-            <w:tcW w:w="546" w:type="dxa"/>
+            <w:tcW w:w="532" w:type="dxa"/>
             <w:tcBorders/>
             <w:vAlign w:val="center"/>
           </w:tcPr>
@@ -1059,7 +1059,7 @@
         </w:tc>
         <w:tc>
           <w:tcPr>
-            <w:tcW w:w="733" w:type="dxa"/>
+            <w:tcW w:w="734" w:type="dxa"/>
             <w:tcBorders/>
             <w:vAlign w:val="center"/>
           </w:tcPr>
@@ -1077,7 +1077,7 @@
         </w:tc>
         <w:tc>
           <w:tcPr>
-            <w:tcW w:w="847" w:type="dxa"/>
+            <w:tcW w:w="857" w:type="dxa"/>
             <w:tcBorders/>
             <w:vAlign w:val="center"/>
           </w:tcPr>
@@ -1095,7 +1095,7 @@
         </w:tc>
         <w:tc>
           <w:tcPr>
-            <w:tcW w:w="599" w:type="dxa"/>
+            <w:tcW w:w="590" w:type="dxa"/>
             <w:tcBorders/>
             <w:vAlign w:val="center"/>
           </w:tcPr>
@@ -1118,22 +1118,22 @@
         </w:trPr>
         <w:tc>
           <w:tcPr>
-            <w:tcW w:w="537" w:type="dxa"/>
-            <w:tcBorders/>
-            <w:vAlign w:val="center"/>
-          </w:tcPr>
-          <w:p>
-            <w:pPr>
-              <w:pStyle w:val="PPTableBody"/>
-              <w:keepNext/>
-              <w:spacing w:before="10" w:after="10"/>
-              <w:jc w:val="left"/>
-            </w:pPr>
-          </w:p>
-        </w:tc>
-        <w:tc>
-          <w:tcPr>
-            <w:tcW w:w="1946" w:type="dxa"/>
+            <w:tcW w:w="523" w:type="dxa"/>
+            <w:tcBorders/>
+            <w:vAlign w:val="center"/>
+          </w:tcPr>
+          <w:p>
+            <w:pPr>
+              <w:pStyle w:val="PPTableBody"/>
+              <w:keepNext/>
+              <w:spacing w:before="10" w:after="10"/>
+              <w:jc w:val="left"/>
+            </w:pPr>
+          </w:p>
+        </w:tc>
+        <w:tc>
+          <w:tcPr>
+            <w:tcW w:w="2044" w:type="dxa"/>
             <w:tcBorders/>
             <w:vAlign w:val="center"/>
           </w:tcPr>
@@ -1151,7 +1151,7 @@
         </w:tc>
         <w:tc>
           <w:tcPr>
-            <w:tcW w:w="300" w:type="dxa"/>
+            <w:tcW w:w="200" w:type="dxa"/>
             <w:tcBorders/>
             <w:vAlign w:val="center"/>
           </w:tcPr>
@@ -1169,7 +1169,7 @@
         </w:tc>
         <w:tc>
           <w:tcPr>
-            <w:tcW w:w="324" w:type="dxa"/>
+            <w:tcW w:w="292" w:type="dxa"/>
             <w:tcBorders/>
             <w:vAlign w:val="center"/>
           </w:tcPr>
@@ -1187,7 +1187,7 @@
         </w:tc>
         <w:tc>
           <w:tcPr>
-            <w:tcW w:w="564" w:type="dxa"/>
+            <w:tcW w:w="551" w:type="dxa"/>
             <w:tcBorders/>
             <w:vAlign w:val="center"/>
           </w:tcPr>
@@ -1205,7 +1205,7 @@
         </w:tc>
         <w:tc>
           <w:tcPr>
-            <w:tcW w:w="546" w:type="dxa"/>
+            <w:tcW w:w="532" w:type="dxa"/>
             <w:tcBorders/>
             <w:vAlign w:val="center"/>
           </w:tcPr>
@@ -1223,7 +1223,7 @@
         </w:tc>
         <w:tc>
           <w:tcPr>
-            <w:tcW w:w="733" w:type="dxa"/>
+            <w:tcW w:w="734" w:type="dxa"/>
             <w:tcBorders/>
             <w:vAlign w:val="center"/>
           </w:tcPr>
@@ -1241,7 +1241,7 @@
         </w:tc>
         <w:tc>
           <w:tcPr>
-            <w:tcW w:w="847" w:type="dxa"/>
+            <w:tcW w:w="857" w:type="dxa"/>
             <w:tcBorders/>
             <w:vAlign w:val="center"/>
           </w:tcPr>
@@ -1259,7 +1259,7 @@
         </w:tc>
         <w:tc>
           <w:tcPr>
-            <w:tcW w:w="599" w:type="dxa"/>
+            <w:tcW w:w="590" w:type="dxa"/>
             <w:tcBorders/>
             <w:vAlign w:val="center"/>
           </w:tcPr>
@@ -1282,22 +1282,22 @@
         </w:trPr>
         <w:tc>
           <w:tcPr>
-            <w:tcW w:w="537" w:type="dxa"/>
-            <w:tcBorders/>
-            <w:vAlign w:val="center"/>
-          </w:tcPr>
-          <w:p>
-            <w:pPr>
-              <w:pStyle w:val="PPTableBody"/>
-              <w:keepNext/>
-              <w:spacing w:before="10" w:after="10"/>
-              <w:jc w:val="left"/>
-            </w:pPr>
-          </w:p>
-        </w:tc>
-        <w:tc>
-          <w:tcPr>
-            <w:tcW w:w="1946" w:type="dxa"/>
+            <w:tcW w:w="523" w:type="dxa"/>
+            <w:tcBorders/>
+            <w:vAlign w:val="center"/>
+          </w:tcPr>
+          <w:p>
+            <w:pPr>
+              <w:pStyle w:val="PPTableBody"/>
+              <w:keepNext/>
+              <w:spacing w:before="10" w:after="10"/>
+              <w:jc w:val="left"/>
+            </w:pPr>
+          </w:p>
+        </w:tc>
+        <w:tc>
+          <w:tcPr>
+            <w:tcW w:w="2044" w:type="dxa"/>
             <w:tcBorders/>
             <w:vAlign w:val="center"/>
           </w:tcPr>
@@ -1315,7 +1315,7 @@
         </w:tc>
         <w:tc>
           <w:tcPr>
-            <w:tcW w:w="300" w:type="dxa"/>
+            <w:tcW w:w="200" w:type="dxa"/>
             <w:tcBorders/>
             <w:vAlign w:val="center"/>
           </w:tcPr>
@@ -1333,7 +1333,7 @@
         </w:tc>
         <w:tc>
           <w:tcPr>
-            <w:tcW w:w="324" w:type="dxa"/>
+            <w:tcW w:w="292" w:type="dxa"/>
             <w:tcBorders/>
             <w:vAlign w:val="center"/>
           </w:tcPr>
@@ -1351,7 +1351,7 @@
         </w:tc>
         <w:tc>
           <w:tcPr>
-            <w:tcW w:w="564" w:type="dxa"/>
+            <w:tcW w:w="551" w:type="dxa"/>
             <w:tcBorders/>
             <w:vAlign w:val="center"/>
           </w:tcPr>
@@ -1369,7 +1369,7 @@
         </w:tc>
         <w:tc>
           <w:tcPr>
-            <w:tcW w:w="546" w:type="dxa"/>
+            <w:tcW w:w="532" w:type="dxa"/>
             <w:tcBorders/>
             <w:vAlign w:val="center"/>
           </w:tcPr>
@@ -1387,7 +1387,7 @@
         </w:tc>
         <w:tc>
           <w:tcPr>
-            <w:tcW w:w="733" w:type="dxa"/>
+            <w:tcW w:w="734" w:type="dxa"/>
             <w:tcBorders/>
             <w:vAlign w:val="center"/>
           </w:tcPr>
@@ -1405,7 +1405,7 @@
         </w:tc>
         <w:tc>
           <w:tcPr>
-            <w:tcW w:w="847" w:type="dxa"/>
+            <w:tcW w:w="857" w:type="dxa"/>
             <w:tcBorders/>
             <w:vAlign w:val="center"/>
           </w:tcPr>
@@ -1423,7 +1423,7 @@
         </w:tc>
         <w:tc>
           <w:tcPr>
-            <w:tcW w:w="599" w:type="dxa"/>
+            <w:tcW w:w="590" w:type="dxa"/>
             <w:tcBorders/>
             <w:vAlign w:val="center"/>
           </w:tcPr>
@@ -1446,22 +1446,22 @@
         </w:trPr>
         <w:tc>
           <w:tcPr>
-            <w:tcW w:w="537" w:type="dxa"/>
-            <w:tcBorders/>
-            <w:vAlign w:val="center"/>
-          </w:tcPr>
-          <w:p>
-            <w:pPr>
-              <w:pStyle w:val="PPTableBody"/>
-              <w:keepNext/>
-              <w:spacing w:before="10" w:after="10"/>
-              <w:jc w:val="left"/>
-            </w:pPr>
-          </w:p>
-        </w:tc>
-        <w:tc>
-          <w:tcPr>
-            <w:tcW w:w="1946" w:type="dxa"/>
+            <w:tcW w:w="523" w:type="dxa"/>
+            <w:tcBorders/>
+            <w:vAlign w:val="center"/>
+          </w:tcPr>
+          <w:p>
+            <w:pPr>
+              <w:pStyle w:val="PPTableBody"/>
+              <w:keepNext/>
+              <w:spacing w:before="10" w:after="10"/>
+              <w:jc w:val="left"/>
+            </w:pPr>
+          </w:p>
+        </w:tc>
+        <w:tc>
+          <w:tcPr>
+            <w:tcW w:w="2044" w:type="dxa"/>
             <w:tcBorders/>
             <w:vAlign w:val="center"/>
           </w:tcPr>
@@ -1479,7 +1479,7 @@
         </w:tc>
         <w:tc>
           <w:tcPr>
-            <w:tcW w:w="300" w:type="dxa"/>
+            <w:tcW w:w="200" w:type="dxa"/>
             <w:tcBorders/>
             <w:vAlign w:val="center"/>
           </w:tcPr>
@@ -1497,7 +1497,7 @@
         </w:tc>
         <w:tc>
           <w:tcPr>
-            <w:tcW w:w="324" w:type="dxa"/>
+            <w:tcW w:w="292" w:type="dxa"/>
             <w:tcBorders/>
             <w:vAlign w:val="center"/>
           </w:tcPr>
@@ -1515,7 +1515,7 @@
         </w:tc>
         <w:tc>
           <w:tcPr>
-            <w:tcW w:w="564" w:type="dxa"/>
+            <w:tcW w:w="551" w:type="dxa"/>
             <w:tcBorders/>
             <w:vAlign w:val="center"/>
           </w:tcPr>
@@ -1533,7 +1533,7 @@
         </w:tc>
         <w:tc>
           <w:tcPr>
-            <w:tcW w:w="546" w:type="dxa"/>
+            <w:tcW w:w="532" w:type="dxa"/>
             <w:tcBorders/>
             <w:vAlign w:val="center"/>
           </w:tcPr>
@@ -1551,7 +1551,7 @@
         </w:tc>
         <w:tc>
           <w:tcPr>
-            <w:tcW w:w="733" w:type="dxa"/>
+            <w:tcW w:w="734" w:type="dxa"/>
             <w:tcBorders/>
             <w:vAlign w:val="center"/>
           </w:tcPr>
@@ -1569,7 +1569,7 @@
         </w:tc>
         <w:tc>
           <w:tcPr>
-            <w:tcW w:w="847" w:type="dxa"/>
+            <w:tcW w:w="857" w:type="dxa"/>
             <w:tcBorders/>
             <w:vAlign w:val="center"/>
           </w:tcPr>
@@ -1587,7 +1587,7 @@
         </w:tc>
         <w:tc>
           <w:tcPr>
-            <w:tcW w:w="599" w:type="dxa"/>
+            <w:tcW w:w="590" w:type="dxa"/>
             <w:tcBorders/>
             <w:vAlign w:val="center"/>
           </w:tcPr>
@@ -1610,7 +1610,7 @@
         </w:trPr>
         <w:tc>
           <w:tcPr>
-            <w:tcW w:w="537" w:type="dxa"/>
+            <w:tcW w:w="523" w:type="dxa"/>
             <w:tcBorders>
               <w:top w:val="single" w:sz="4" w:space="0" w:color="auto"/>
             </w:tcBorders>
@@ -1630,7 +1630,7 @@
         </w:tc>
         <w:tc>
           <w:tcPr>
-            <w:tcW w:w="1946" w:type="dxa"/>
+            <w:tcW w:w="2044" w:type="dxa"/>
             <w:tcBorders>
               <w:top w:val="single" w:sz="4" w:space="0" w:color="auto"/>
             </w:tcBorders>
@@ -1650,7 +1650,7 @@
         </w:tc>
         <w:tc>
           <w:tcPr>
-            <w:tcW w:w="300" w:type="dxa"/>
+            <w:tcW w:w="200" w:type="dxa"/>
             <w:tcBorders>
               <w:top w:val="single" w:sz="4" w:space="0" w:color="auto"/>
             </w:tcBorders>
@@ -1670,7 +1670,7 @@
         </w:tc>
         <w:tc>
           <w:tcPr>
-            <w:tcW w:w="324" w:type="dxa"/>
+            <w:tcW w:w="292" w:type="dxa"/>
             <w:tcBorders>
               <w:top w:val="single" w:sz="4" w:space="0" w:color="auto"/>
             </w:tcBorders>
@@ -1690,7 +1690,7 @@
         </w:tc>
         <w:tc>
           <w:tcPr>
-            <w:tcW w:w="564" w:type="dxa"/>
+            <w:tcW w:w="551" w:type="dxa"/>
             <w:tcBorders>
               <w:top w:val="single" w:sz="4" w:space="0" w:color="auto"/>
             </w:tcBorders>
@@ -1710,7 +1710,7 @@
         </w:tc>
         <w:tc>
           <w:tcPr>
-            <w:tcW w:w="546" w:type="dxa"/>
+            <w:tcW w:w="532" w:type="dxa"/>
             <w:tcBorders>
               <w:top w:val="single" w:sz="4" w:space="0" w:color="auto"/>
             </w:tcBorders>
@@ -1730,7 +1730,7 @@
         </w:tc>
         <w:tc>
           <w:tcPr>
-            <w:tcW w:w="733" w:type="dxa"/>
+            <w:tcW w:w="734" w:type="dxa"/>
             <w:tcBorders>
               <w:top w:val="single" w:sz="4" w:space="0" w:color="auto"/>
             </w:tcBorders>
@@ -1750,7 +1750,7 @@
         </w:tc>
         <w:tc>
           <w:tcPr>
-            <w:tcW w:w="847" w:type="dxa"/>
+            <w:tcW w:w="857" w:type="dxa"/>
             <w:tcBorders>
               <w:top w:val="single" w:sz="4" w:space="0" w:color="auto"/>
             </w:tcBorders>
@@ -1770,7 +1770,7 @@
         </w:tc>
         <w:tc>
           <w:tcPr>
-            <w:tcW w:w="599" w:type="dxa"/>
+            <w:tcW w:w="590" w:type="dxa"/>
             <w:tcBorders>
               <w:top w:val="single" w:sz="4" w:space="0" w:color="auto"/>
             </w:tcBorders>
@@ -1795,22 +1795,22 @@
         </w:trPr>
         <w:tc>
           <w:tcPr>
-            <w:tcW w:w="537" w:type="dxa"/>
-            <w:tcBorders/>
-            <w:vAlign w:val="center"/>
-          </w:tcPr>
-          <w:p>
-            <w:pPr>
-              <w:pStyle w:val="PPTableBody"/>
-              <w:keepNext/>
-              <w:spacing w:before="10" w:after="10"/>
-              <w:jc w:val="left"/>
-            </w:pPr>
-          </w:p>
-        </w:tc>
-        <w:tc>
-          <w:tcPr>
-            <w:tcW w:w="1946" w:type="dxa"/>
+            <w:tcW w:w="523" w:type="dxa"/>
+            <w:tcBorders/>
+            <w:vAlign w:val="center"/>
+          </w:tcPr>
+          <w:p>
+            <w:pPr>
+              <w:pStyle w:val="PPTableBody"/>
+              <w:keepNext/>
+              <w:spacing w:before="10" w:after="10"/>
+              <w:jc w:val="left"/>
+            </w:pPr>
+          </w:p>
+        </w:tc>
+        <w:tc>
+          <w:tcPr>
+            <w:tcW w:w="2044" w:type="dxa"/>
             <w:tcBorders/>
             <w:vAlign w:val="center"/>
           </w:tcPr>
@@ -1828,7 +1828,7 @@
         </w:tc>
         <w:tc>
           <w:tcPr>
-            <w:tcW w:w="300" w:type="dxa"/>
+            <w:tcW w:w="200" w:type="dxa"/>
             <w:tcBorders/>
             <w:vAlign w:val="center"/>
           </w:tcPr>
@@ -1846,7 +1846,7 @@
         </w:tc>
         <w:tc>
           <w:tcPr>
-            <w:tcW w:w="324" w:type="dxa"/>
+            <w:tcW w:w="292" w:type="dxa"/>
             <w:tcBorders/>
             <w:vAlign w:val="center"/>
           </w:tcPr>
@@ -1864,7 +1864,7 @@
         </w:tc>
         <w:tc>
           <w:tcPr>
-            <w:tcW w:w="564" w:type="dxa"/>
+            <w:tcW w:w="551" w:type="dxa"/>
             <w:tcBorders/>
             <w:vAlign w:val="center"/>
           </w:tcPr>
@@ -1882,7 +1882,7 @@
         </w:tc>
         <w:tc>
           <w:tcPr>
-            <w:tcW w:w="546" w:type="dxa"/>
+            <w:tcW w:w="532" w:type="dxa"/>
             <w:tcBorders/>
             <w:vAlign w:val="center"/>
           </w:tcPr>
@@ -1900,7 +1900,7 @@
         </w:tc>
         <w:tc>
           <w:tcPr>
-            <w:tcW w:w="733" w:type="dxa"/>
+            <w:tcW w:w="734" w:type="dxa"/>
             <w:tcBorders/>
             <w:vAlign w:val="center"/>
           </w:tcPr>
@@ -1918,7 +1918,7 @@
         </w:tc>
         <w:tc>
           <w:tcPr>
-            <w:tcW w:w="847" w:type="dxa"/>
+            <w:tcW w:w="857" w:type="dxa"/>
             <w:tcBorders/>
             <w:vAlign w:val="center"/>
           </w:tcPr>
@@ -1936,7 +1936,7 @@
         </w:tc>
         <w:tc>
           <w:tcPr>
-            <w:tcW w:w="599" w:type="dxa"/>
+            <w:tcW w:w="590" w:type="dxa"/>
             <w:tcBorders/>
             <w:vAlign w:val="center"/>
           </w:tcPr>
@@ -1959,22 +1959,22 @@
         </w:trPr>
         <w:tc>
           <w:tcPr>
-            <w:tcW w:w="537" w:type="dxa"/>
-            <w:tcBorders/>
-            <w:vAlign w:val="center"/>
-          </w:tcPr>
-          <w:p>
-            <w:pPr>
-              <w:pStyle w:val="PPTableBody"/>
-              <w:keepNext/>
-              <w:spacing w:before="10" w:after="10"/>
-              <w:jc w:val="left"/>
-            </w:pPr>
-          </w:p>
-        </w:tc>
-        <w:tc>
-          <w:tcPr>
-            <w:tcW w:w="1946" w:type="dxa"/>
+            <w:tcW w:w="523" w:type="dxa"/>
+            <w:tcBorders/>
+            <w:vAlign w:val="center"/>
+          </w:tcPr>
+          <w:p>
+            <w:pPr>
+              <w:pStyle w:val="PPTableBody"/>
+              <w:keepNext/>
+              <w:spacing w:before="10" w:after="10"/>
+              <w:jc w:val="left"/>
+            </w:pPr>
+          </w:p>
+        </w:tc>
+        <w:tc>
+          <w:tcPr>
+            <w:tcW w:w="2044" w:type="dxa"/>
             <w:tcBorders/>
             <w:vAlign w:val="center"/>
           </w:tcPr>
@@ -1992,7 +1992,7 @@
         </w:tc>
         <w:tc>
           <w:tcPr>
-            <w:tcW w:w="300" w:type="dxa"/>
+            <w:tcW w:w="200" w:type="dxa"/>
             <w:tcBorders/>
             <w:vAlign w:val="center"/>
           </w:tcPr>
@@ -2010,7 +2010,7 @@
         </w:tc>
         <w:tc>
           <w:tcPr>
-            <w:tcW w:w="324" w:type="dxa"/>
+            <w:tcW w:w="292" w:type="dxa"/>
             <w:tcBorders/>
             <w:vAlign w:val="center"/>
           </w:tcPr>
@@ -2028,7 +2028,7 @@
         </w:tc>
         <w:tc>
           <w:tcPr>
-            <w:tcW w:w="564" w:type="dxa"/>
+            <w:tcW w:w="551" w:type="dxa"/>
             <w:tcBorders/>
             <w:vAlign w:val="center"/>
           </w:tcPr>
@@ -2046,7 +2046,7 @@
         </w:tc>
         <w:tc>
           <w:tcPr>
-            <w:tcW w:w="546" w:type="dxa"/>
+            <w:tcW w:w="532" w:type="dxa"/>
             <w:tcBorders/>
             <w:vAlign w:val="center"/>
           </w:tcPr>
@@ -2064,7 +2064,7 @@
         </w:tc>
         <w:tc>
           <w:tcPr>
-            <w:tcW w:w="733" w:type="dxa"/>
+            <w:tcW w:w="734" w:type="dxa"/>
             <w:tcBorders/>
             <w:vAlign w:val="center"/>
           </w:tcPr>
@@ -2082,7 +2082,7 @@
         </w:tc>
         <w:tc>
           <w:tcPr>
-            <w:tcW w:w="847" w:type="dxa"/>
+            <w:tcW w:w="857" w:type="dxa"/>
             <w:tcBorders/>
             <w:vAlign w:val="center"/>
           </w:tcPr>
@@ -2100,7 +2100,7 @@
         </w:tc>
         <w:tc>
           <w:tcPr>
-            <w:tcW w:w="599" w:type="dxa"/>
+            <w:tcW w:w="590" w:type="dxa"/>
             <w:tcBorders/>
             <w:vAlign w:val="center"/>
           </w:tcPr>
@@ -2123,22 +2123,22 @@
         </w:trPr>
         <w:tc>
           <w:tcPr>
-            <w:tcW w:w="537" w:type="dxa"/>
-            <w:tcBorders/>
-            <w:vAlign w:val="center"/>
-          </w:tcPr>
-          <w:p>
-            <w:pPr>
-              <w:pStyle w:val="PPTableBody"/>
-              <w:keepNext/>
-              <w:spacing w:before="10" w:after="10"/>
-              <w:jc w:val="left"/>
-            </w:pPr>
-          </w:p>
-        </w:tc>
-        <w:tc>
-          <w:tcPr>
-            <w:tcW w:w="1946" w:type="dxa"/>
+            <w:tcW w:w="523" w:type="dxa"/>
+            <w:tcBorders/>
+            <w:vAlign w:val="center"/>
+          </w:tcPr>
+          <w:p>
+            <w:pPr>
+              <w:pStyle w:val="PPTableBody"/>
+              <w:keepNext/>
+              <w:spacing w:before="10" w:after="10"/>
+              <w:jc w:val="left"/>
+            </w:pPr>
+          </w:p>
+        </w:tc>
+        <w:tc>
+          <w:tcPr>
+            <w:tcW w:w="2044" w:type="dxa"/>
             <w:tcBorders/>
             <w:vAlign w:val="center"/>
           </w:tcPr>
@@ -2156,7 +2156,7 @@
         </w:tc>
         <w:tc>
           <w:tcPr>
-            <w:tcW w:w="300" w:type="dxa"/>
+            <w:tcW w:w="200" w:type="dxa"/>
             <w:tcBorders/>
             <w:vAlign w:val="center"/>
           </w:tcPr>
@@ -2174,7 +2174,7 @@
         </w:tc>
         <w:tc>
           <w:tcPr>
-            <w:tcW w:w="324" w:type="dxa"/>
+            <w:tcW w:w="292" w:type="dxa"/>
             <w:tcBorders/>
             <w:vAlign w:val="center"/>
           </w:tcPr>
@@ -2192,7 +2192,7 @@
         </w:tc>
         <w:tc>
           <w:tcPr>
-            <w:tcW w:w="564" w:type="dxa"/>
+            <w:tcW w:w="551" w:type="dxa"/>
             <w:tcBorders/>
             <w:vAlign w:val="center"/>
           </w:tcPr>
@@ -2210,7 +2210,7 @@
         </w:tc>
         <w:tc>
           <w:tcPr>
-            <w:tcW w:w="546" w:type="dxa"/>
+            <w:tcW w:w="532" w:type="dxa"/>
             <w:tcBorders/>
             <w:vAlign w:val="center"/>
           </w:tcPr>
@@ -2228,7 +2228,7 @@
         </w:tc>
         <w:tc>
           <w:tcPr>
-            <w:tcW w:w="733" w:type="dxa"/>
+            <w:tcW w:w="734" w:type="dxa"/>
             <w:tcBorders/>
             <w:vAlign w:val="center"/>
           </w:tcPr>
@@ -2246,7 +2246,7 @@
         </w:tc>
         <w:tc>
           <w:tcPr>
-            <w:tcW w:w="847" w:type="dxa"/>
+            <w:tcW w:w="857" w:type="dxa"/>
             <w:tcBorders/>
             <w:vAlign w:val="center"/>
           </w:tcPr>
@@ -2264,7 +2264,7 @@
         </w:tc>
         <w:tc>
           <w:tcPr>
-            <w:tcW w:w="599" w:type="dxa"/>
+            <w:tcW w:w="590" w:type="dxa"/>
             <w:tcBorders/>
             <w:vAlign w:val="center"/>
           </w:tcPr>
@@ -2287,22 +2287,22 @@
         </w:trPr>
         <w:tc>
           <w:tcPr>
-            <w:tcW w:w="537" w:type="dxa"/>
-            <w:tcBorders/>
-            <w:vAlign w:val="center"/>
-          </w:tcPr>
-          <w:p>
-            <w:pPr>
-              <w:pStyle w:val="PPTableBody"/>
-              <w:keepNext/>
-              <w:spacing w:before="10" w:after="10"/>
-              <w:jc w:val="left"/>
-            </w:pPr>
-          </w:p>
-        </w:tc>
-        <w:tc>
-          <w:tcPr>
-            <w:tcW w:w="1946" w:type="dxa"/>
+            <w:tcW w:w="523" w:type="dxa"/>
+            <w:tcBorders/>
+            <w:vAlign w:val="center"/>
+          </w:tcPr>
+          <w:p>
+            <w:pPr>
+              <w:pStyle w:val="PPTableBody"/>
+              <w:keepNext/>
+              <w:spacing w:before="10" w:after="10"/>
+              <w:jc w:val="left"/>
+            </w:pPr>
+          </w:p>
+        </w:tc>
+        <w:tc>
+          <w:tcPr>
+            <w:tcW w:w="2044" w:type="dxa"/>
             <w:tcBorders/>
             <w:vAlign w:val="center"/>
           </w:tcPr>
@@ -2320,7 +2320,7 @@
         </w:tc>
         <w:tc>
           <w:tcPr>
-            <w:tcW w:w="300" w:type="dxa"/>
+            <w:tcW w:w="200" w:type="dxa"/>
             <w:tcBorders/>
             <w:vAlign w:val="center"/>
           </w:tcPr>
@@ -2338,7 +2338,7 @@
         </w:tc>
         <w:tc>
           <w:tcPr>
-            <w:tcW w:w="324" w:type="dxa"/>
+            <w:tcW w:w="292" w:type="dxa"/>
             <w:tcBorders/>
             <w:vAlign w:val="center"/>
           </w:tcPr>
@@ -2356,7 +2356,7 @@
         </w:tc>
         <w:tc>
           <w:tcPr>
-            <w:tcW w:w="564" w:type="dxa"/>
+            <w:tcW w:w="551" w:type="dxa"/>
             <w:tcBorders/>
             <w:vAlign w:val="center"/>
           </w:tcPr>
@@ -2374,7 +2374,7 @@
         </w:tc>
         <w:tc>
           <w:tcPr>
-            <w:tcW w:w="546" w:type="dxa"/>
+            <w:tcW w:w="532" w:type="dxa"/>
             <w:tcBorders/>
             <w:vAlign w:val="center"/>
           </w:tcPr>
@@ -2392,7 +2392,7 @@
         </w:tc>
         <w:tc>
           <w:tcPr>
-            <w:tcW w:w="733" w:type="dxa"/>
+            <w:tcW w:w="734" w:type="dxa"/>
             <w:tcBorders/>
             <w:vAlign w:val="center"/>
           </w:tcPr>
@@ -2410,7 +2410,7 @@
         </w:tc>
         <w:tc>
           <w:tcPr>
-            <w:tcW w:w="847" w:type="dxa"/>
+            <w:tcW w:w="857" w:type="dxa"/>
             <w:tcBorders/>
             <w:vAlign w:val="center"/>
           </w:tcPr>
@@ -2428,7 +2428,7 @@
         </w:tc>
         <w:tc>
           <w:tcPr>
-            <w:tcW w:w="599" w:type="dxa"/>
+            <w:tcW w:w="590" w:type="dxa"/>
             <w:tcBorders/>
             <w:vAlign w:val="center"/>
           </w:tcPr>
@@ -2451,7 +2451,7 @@
         </w:trPr>
         <w:tc>
           <w:tcPr>
-            <w:tcW w:w="537" w:type="dxa"/>
+            <w:tcW w:w="523" w:type="dxa"/>
             <w:tcBorders>
               <w:bottom w:val="single" w:sz="8" w:space="0" w:color="auto"/>
             </w:tcBorders>
@@ -2467,7 +2467,7 @@
         </w:tc>
         <w:tc>
           <w:tcPr>
-            <w:tcW w:w="1946" w:type="dxa"/>
+            <w:tcW w:w="2044" w:type="dxa"/>
             <w:tcBorders>
               <w:bottom w:val="single" w:sz="8" w:space="0" w:color="auto"/>
             </w:tcBorders>
@@ -2486,7 +2486,7 @@
         </w:tc>
         <w:tc>
           <w:tcPr>
-            <w:tcW w:w="300" w:type="dxa"/>
+            <w:tcW w:w="200" w:type="dxa"/>
             <w:tcBorders>
               <w:bottom w:val="single" w:sz="8" w:space="0" w:color="auto"/>
             </w:tcBorders>
@@ -2505,7 +2505,7 @@
         </w:tc>
         <w:tc>
           <w:tcPr>
-            <w:tcW w:w="324" w:type="dxa"/>
+            <w:tcW w:w="292" w:type="dxa"/>
             <w:tcBorders>
               <w:bottom w:val="single" w:sz="8" w:space="0" w:color="auto"/>
             </w:tcBorders>
@@ -2524,7 +2524,7 @@
         </w:tc>
         <w:tc>
           <w:tcPr>
-            <w:tcW w:w="564" w:type="dxa"/>
+            <w:tcW w:w="551" w:type="dxa"/>
             <w:tcBorders>
               <w:bottom w:val="single" w:sz="8" w:space="0" w:color="auto"/>
             </w:tcBorders>
@@ -2543,7 +2543,7 @@
         </w:tc>
         <w:tc>
           <w:tcPr>
-            <w:tcW w:w="546" w:type="dxa"/>
+            <w:tcW w:w="532" w:type="dxa"/>
             <w:tcBorders>
               <w:bottom w:val="single" w:sz="8" w:space="0" w:color="auto"/>
             </w:tcBorders>
@@ -2562,7 +2562,7 @@
         </w:tc>
         <w:tc>
           <w:tcPr>
-            <w:tcW w:w="733" w:type="dxa"/>
+            <w:tcW w:w="734" w:type="dxa"/>
             <w:tcBorders>
               <w:bottom w:val="single" w:sz="8" w:space="0" w:color="auto"/>
             </w:tcBorders>
@@ -2581,7 +2581,7 @@
         </w:tc>
         <w:tc>
           <w:tcPr>
-            <w:tcW w:w="847" w:type="dxa"/>
+            <w:tcW w:w="857" w:type="dxa"/>
             <w:tcBorders>
               <w:bottom w:val="single" w:sz="8" w:space="0" w:color="auto"/>
             </w:tcBorders>
@@ -2600,7 +2600,7 @@
         </w:tc>
         <w:tc>
           <w:tcPr>
-            <w:tcW w:w="599" w:type="dxa"/>
+            <w:tcW w:w="590" w:type="dxa"/>
             <w:tcBorders>
               <w:bottom w:val="single" w:sz="8" w:space="0" w:color="auto"/>
             </w:tcBorders>
@@ -2629,7 +2629,7 @@
         <w:pStyle w:val="PPBodyMainText"/>
       </w:pPr>
       <w:r>
-        <w:t xml:space="preserve">The pattern behind the summary in the paper is visible here. Wherever an earlier labeled window exists, retraining on it helps in almost every temporal window and the triage escalates accordingly. The geographic windows of the census tasks have no earlier window. Importance weighting rarely helps there. The triage advises against retraining in most of them. The remaining wrong verdicts fall mostly on CLEAR-10 with LR and on the geographic ACS Employment windows.</w:t>
+        <w:t xml:space="preserve">Where an earlier labeled window exists, retraining on it helps in almost every temporal window. The triage escalates in those windows. The geographic windows of the census tasks have no earlier window. There, importance weighting rarely helps and the triage mostly advises against a retrain. Most of the remaining wrong verdicts come from CLEAR-10 with LR and from the geographic windows of ACS Employment.</w:t>
       </w:r>
     </w:p>
     <w:p>
@@ -2647,19 +2647,19 @@
         <w:ind w:firstLine="0"/>
       </w:pPr>
       <w:r>
-        <w:t xml:space="preserve">From 2019 the Census Bureau replaced the relationship variable RELP with RELSHIPP, which splits spouses and partners by sex </w:t>
+        <w:t xml:space="preserve">The ACS windows run from 2014 to 2023, but one of their features changed its coding halfway through. From 2019 the Census Bureau replaced the relationship variable RELP with RELSHIPP, whose codes split spouses and partners by sex </w:t>
       </w:r>
       <w:r>
         <w:t xml:space="preserve">[1]</w:t>
       </w:r>
       <w:r>
-        <w:t xml:space="preserve">. To compare windows before and after 2019, the RELSHIPP codes are mapped back to RELP by matching the code labels of the 2018 and 2019 data dictionaries. Table </w:t>
+        <w:t xml:space="preserve">. To compare windows before and after 2019, we map the RELSHIPP codes back to RELP by matching the code labels of the 2018 and 2019 data dictionaries. Table </w:t>
       </w:r>
       <w:r>
         <w:t xml:space="preserve">S2</w:t>
       </w:r>
       <w:r>
-        <w:t xml:space="preserve"> lists the mapping that the code applies.</w:t>
+        <w:t xml:space="preserve"> lists the mapping as the code applies it.</w:t>
       </w:r>
     </w:p>
     <w:p>
@@ -2688,15 +2688,15 @@
         <w:jc w:val="center"/>
         <w:tblLayout w:type="fixed"/>
         <w:tblCellMar>
-          <w:left w:w="45" w:type="dxa"/>
-          <w:right w:w="45" w:type="dxa"/>
+          <w:left w:w="30" w:type="dxa"/>
+          <w:right w:w="30" w:type="dxa"/>
         </w:tblCellMar>
         <w:tblLook w:val="04A0" w:firstRow="1" w:lastRow="0" w:firstColumn="1" w:lastColumn="0" w:noHBand="0" w:noVBand="1"/>
       </w:tblPr>
       <w:tblGrid>
-        <w:gridCol w:w="511"/>
-        <w:gridCol w:w="3119"/>
-        <w:gridCol w:w="1923"/>
+        <w:gridCol w:w="494"/>
+        <w:gridCol w:w="3311"/>
+        <w:gridCol w:w="2019"/>
       </w:tblGrid>
       <w:tr>
         <w:trPr>
@@ -2705,7 +2705,7 @@
         </w:trPr>
         <w:tc>
           <w:tcPr>
-            <w:tcW w:w="511" w:type="dxa"/>
+            <w:tcW w:w="494" w:type="dxa"/>
             <w:tcBorders>
               <w:top w:val="single" w:sz="8" w:space="0" w:color="auto"/>
             </w:tcBorders>
@@ -2725,7 +2725,7 @@
         </w:tc>
         <w:tc>
           <w:tcPr>
-            <w:tcW w:w="3119" w:type="dxa"/>
+            <w:tcW w:w="3311" w:type="dxa"/>
             <w:tcBorders>
               <w:top w:val="single" w:sz="8" w:space="0" w:color="auto"/>
             </w:tcBorders>
@@ -2745,7 +2745,7 @@
         </w:tc>
         <w:tc>
           <w:tcPr>
-            <w:tcW w:w="1923" w:type="dxa"/>
+            <w:tcW w:w="2019" w:type="dxa"/>
             <w:tcBorders>
               <w:top w:val="single" w:sz="8" w:space="0" w:color="auto"/>
             </w:tcBorders>
@@ -2770,7 +2770,7 @@
         </w:trPr>
         <w:tc>
           <w:tcPr>
-            <w:tcW w:w="511" w:type="dxa"/>
+            <w:tcW w:w="494" w:type="dxa"/>
             <w:tcBorders>
               <w:top w:val="single" w:sz="4" w:space="0" w:color="auto"/>
             </w:tcBorders>
@@ -2790,7 +2790,7 @@
         </w:tc>
         <w:tc>
           <w:tcPr>
-            <w:tcW w:w="3119" w:type="dxa"/>
+            <w:tcW w:w="3311" w:type="dxa"/>
             <w:tcBorders>
               <w:top w:val="single" w:sz="4" w:space="0" w:color="auto"/>
             </w:tcBorders>
@@ -2810,7 +2810,7 @@
         </w:tc>
         <w:tc>
           <w:tcPr>
-            <w:tcW w:w="1923" w:type="dxa"/>
+            <w:tcW w:w="2019" w:type="dxa"/>
             <w:tcBorders>
               <w:top w:val="single" w:sz="4" w:space="0" w:color="auto"/>
             </w:tcBorders>
@@ -2835,7 +2835,7 @@
         </w:trPr>
         <w:tc>
           <w:tcPr>
-            <w:tcW w:w="511" w:type="dxa"/>
+            <w:tcW w:w="494" w:type="dxa"/>
             <w:tcBorders/>
             <w:vAlign w:val="center"/>
           </w:tcPr>
@@ -2853,7 +2853,7 @@
         </w:tc>
         <w:tc>
           <w:tcPr>
-            <w:tcW w:w="3119" w:type="dxa"/>
+            <w:tcW w:w="3311" w:type="dxa"/>
             <w:tcBorders/>
             <w:vAlign w:val="center"/>
           </w:tcPr>
@@ -2871,7 +2871,7 @@
         </w:tc>
         <w:tc>
           <w:tcPr>
-            <w:tcW w:w="1923" w:type="dxa"/>
+            <w:tcW w:w="2019" w:type="dxa"/>
             <w:tcBorders/>
             <w:vAlign w:val="center"/>
           </w:tcPr>
@@ -2894,7 +2894,7 @@
         </w:trPr>
         <w:tc>
           <w:tcPr>
-            <w:tcW w:w="511" w:type="dxa"/>
+            <w:tcW w:w="494" w:type="dxa"/>
             <w:tcBorders/>
             <w:vAlign w:val="center"/>
           </w:tcPr>
@@ -2912,7 +2912,7 @@
         </w:tc>
         <w:tc>
           <w:tcPr>
-            <w:tcW w:w="3119" w:type="dxa"/>
+            <w:tcW w:w="3311" w:type="dxa"/>
             <w:tcBorders/>
             <w:vAlign w:val="center"/>
           </w:tcPr>
@@ -2930,7 +2930,7 @@
         </w:tc>
         <w:tc>
           <w:tcPr>
-            <w:tcW w:w="1923" w:type="dxa"/>
+            <w:tcW w:w="2019" w:type="dxa"/>
             <w:tcBorders/>
             <w:vAlign w:val="center"/>
           </w:tcPr>
@@ -2953,7 +2953,7 @@
         </w:trPr>
         <w:tc>
           <w:tcPr>
-            <w:tcW w:w="511" w:type="dxa"/>
+            <w:tcW w:w="494" w:type="dxa"/>
             <w:tcBorders/>
             <w:vAlign w:val="center"/>
           </w:tcPr>
@@ -2971,7 +2971,7 @@
         </w:tc>
         <w:tc>
           <w:tcPr>
-            <w:tcW w:w="3119" w:type="dxa"/>
+            <w:tcW w:w="3311" w:type="dxa"/>
             <w:tcBorders/>
             <w:vAlign w:val="center"/>
           </w:tcPr>
@@ -2989,7 +2989,7 @@
         </w:tc>
         <w:tc>
           <w:tcPr>
-            <w:tcW w:w="1923" w:type="dxa"/>
+            <w:tcW w:w="2019" w:type="dxa"/>
             <w:tcBorders/>
             <w:vAlign w:val="center"/>
           </w:tcPr>
@@ -3012,7 +3012,7 @@
         </w:trPr>
         <w:tc>
           <w:tcPr>
-            <w:tcW w:w="511" w:type="dxa"/>
+            <w:tcW w:w="494" w:type="dxa"/>
             <w:tcBorders/>
             <w:vAlign w:val="center"/>
           </w:tcPr>
@@ -3030,7 +3030,7 @@
         </w:tc>
         <w:tc>
           <w:tcPr>
-            <w:tcW w:w="3119" w:type="dxa"/>
+            <w:tcW w:w="3311" w:type="dxa"/>
             <w:tcBorders/>
             <w:vAlign w:val="center"/>
           </w:tcPr>
@@ -3048,7 +3048,7 @@
         </w:tc>
         <w:tc>
           <w:tcPr>
-            <w:tcW w:w="1923" w:type="dxa"/>
+            <w:tcW w:w="2019" w:type="dxa"/>
             <w:tcBorders/>
             <w:vAlign w:val="center"/>
           </w:tcPr>
@@ -3071,7 +3071,7 @@
         </w:trPr>
         <w:tc>
           <w:tcPr>
-            <w:tcW w:w="511" w:type="dxa"/>
+            <w:tcW w:w="494" w:type="dxa"/>
             <w:tcBorders/>
             <w:vAlign w:val="center"/>
           </w:tcPr>
@@ -3089,7 +3089,7 @@
         </w:tc>
         <w:tc>
           <w:tcPr>
-            <w:tcW w:w="3119" w:type="dxa"/>
+            <w:tcW w:w="3311" w:type="dxa"/>
             <w:tcBorders/>
             <w:vAlign w:val="center"/>
           </w:tcPr>
@@ -3107,7 +3107,7 @@
         </w:tc>
         <w:tc>
           <w:tcPr>
-            <w:tcW w:w="1923" w:type="dxa"/>
+            <w:tcW w:w="2019" w:type="dxa"/>
             <w:tcBorders/>
             <w:vAlign w:val="center"/>
           </w:tcPr>
@@ -3130,7 +3130,7 @@
         </w:trPr>
         <w:tc>
           <w:tcPr>
-            <w:tcW w:w="511" w:type="dxa"/>
+            <w:tcW w:w="494" w:type="dxa"/>
             <w:tcBorders/>
             <w:vAlign w:val="center"/>
           </w:tcPr>
@@ -3148,7 +3148,7 @@
         </w:tc>
         <w:tc>
           <w:tcPr>
-            <w:tcW w:w="3119" w:type="dxa"/>
+            <w:tcW w:w="3311" w:type="dxa"/>
             <w:tcBorders/>
             <w:vAlign w:val="center"/>
           </w:tcPr>
@@ -3166,7 +3166,7 @@
         </w:tc>
         <w:tc>
           <w:tcPr>
-            <w:tcW w:w="1923" w:type="dxa"/>
+            <w:tcW w:w="2019" w:type="dxa"/>
             <w:tcBorders/>
             <w:vAlign w:val="center"/>
           </w:tcPr>
@@ -3189,7 +3189,7 @@
         </w:trPr>
         <w:tc>
           <w:tcPr>
-            <w:tcW w:w="511" w:type="dxa"/>
+            <w:tcW w:w="494" w:type="dxa"/>
             <w:tcBorders/>
             <w:vAlign w:val="center"/>
           </w:tcPr>
@@ -3207,7 +3207,7 @@
         </w:tc>
         <w:tc>
           <w:tcPr>
-            <w:tcW w:w="3119" w:type="dxa"/>
+            <w:tcW w:w="3311" w:type="dxa"/>
             <w:tcBorders/>
             <w:vAlign w:val="center"/>
           </w:tcPr>
@@ -3225,7 +3225,7 @@
         </w:tc>
         <w:tc>
           <w:tcPr>
-            <w:tcW w:w="1923" w:type="dxa"/>
+            <w:tcW w:w="2019" w:type="dxa"/>
             <w:tcBorders/>
             <w:vAlign w:val="center"/>
           </w:tcPr>
@@ -3248,7 +3248,7 @@
         </w:trPr>
         <w:tc>
           <w:tcPr>
-            <w:tcW w:w="511" w:type="dxa"/>
+            <w:tcW w:w="494" w:type="dxa"/>
             <w:tcBorders/>
             <w:vAlign w:val="center"/>
           </w:tcPr>
@@ -3266,7 +3266,7 @@
         </w:tc>
         <w:tc>
           <w:tcPr>
-            <w:tcW w:w="3119" w:type="dxa"/>
+            <w:tcW w:w="3311" w:type="dxa"/>
             <w:tcBorders/>
             <w:vAlign w:val="center"/>
           </w:tcPr>
@@ -3284,7 +3284,7 @@
         </w:tc>
         <w:tc>
           <w:tcPr>
-            <w:tcW w:w="1923" w:type="dxa"/>
+            <w:tcW w:w="2019" w:type="dxa"/>
             <w:tcBorders/>
             <w:vAlign w:val="center"/>
           </w:tcPr>
@@ -3307,7 +3307,7 @@
         </w:trPr>
         <w:tc>
           <w:tcPr>
-            <w:tcW w:w="511" w:type="dxa"/>
+            <w:tcW w:w="494" w:type="dxa"/>
             <w:tcBorders/>
             <w:vAlign w:val="center"/>
           </w:tcPr>
@@ -3325,7 +3325,7 @@
         </w:tc>
         <w:tc>
           <w:tcPr>
-            <w:tcW w:w="3119" w:type="dxa"/>
+            <w:tcW w:w="3311" w:type="dxa"/>
             <w:tcBorders/>
             <w:vAlign w:val="center"/>
           </w:tcPr>
@@ -3343,7 +3343,7 @@
         </w:tc>
         <w:tc>
           <w:tcPr>
-            <w:tcW w:w="1923" w:type="dxa"/>
+            <w:tcW w:w="2019" w:type="dxa"/>
             <w:tcBorders/>
             <w:vAlign w:val="center"/>
           </w:tcPr>
@@ -3366,7 +3366,7 @@
         </w:trPr>
         <w:tc>
           <w:tcPr>
-            <w:tcW w:w="511" w:type="dxa"/>
+            <w:tcW w:w="494" w:type="dxa"/>
             <w:tcBorders/>
             <w:vAlign w:val="center"/>
           </w:tcPr>
@@ -3384,7 +3384,7 @@
         </w:tc>
         <w:tc>
           <w:tcPr>
-            <w:tcW w:w="3119" w:type="dxa"/>
+            <w:tcW w:w="3311" w:type="dxa"/>
             <w:tcBorders/>
             <w:vAlign w:val="center"/>
           </w:tcPr>
@@ -3402,7 +3402,7 @@
         </w:tc>
         <w:tc>
           <w:tcPr>
-            <w:tcW w:w="1923" w:type="dxa"/>
+            <w:tcW w:w="2019" w:type="dxa"/>
             <w:tcBorders/>
             <w:vAlign w:val="center"/>
           </w:tcPr>
@@ -3425,7 +3425,7 @@
         </w:trPr>
         <w:tc>
           <w:tcPr>
-            <w:tcW w:w="511" w:type="dxa"/>
+            <w:tcW w:w="494" w:type="dxa"/>
             <w:tcBorders/>
             <w:vAlign w:val="center"/>
           </w:tcPr>
@@ -3443,7 +3443,7 @@
         </w:tc>
         <w:tc>
           <w:tcPr>
-            <w:tcW w:w="3119" w:type="dxa"/>
+            <w:tcW w:w="3311" w:type="dxa"/>
             <w:tcBorders/>
             <w:vAlign w:val="center"/>
           </w:tcPr>
@@ -3461,7 +3461,7 @@
         </w:tc>
         <w:tc>
           <w:tcPr>
-            <w:tcW w:w="1923" w:type="dxa"/>
+            <w:tcW w:w="2019" w:type="dxa"/>
             <w:tcBorders/>
             <w:vAlign w:val="center"/>
           </w:tcPr>
@@ -3484,7 +3484,7 @@
         </w:trPr>
         <w:tc>
           <w:tcPr>
-            <w:tcW w:w="511" w:type="dxa"/>
+            <w:tcW w:w="494" w:type="dxa"/>
             <w:tcBorders/>
             <w:vAlign w:val="center"/>
           </w:tcPr>
@@ -3502,7 +3502,7 @@
         </w:tc>
         <w:tc>
           <w:tcPr>
-            <w:tcW w:w="3119" w:type="dxa"/>
+            <w:tcW w:w="3311" w:type="dxa"/>
             <w:tcBorders/>
             <w:vAlign w:val="center"/>
           </w:tcPr>
@@ -3520,7 +3520,7 @@
         </w:tc>
         <w:tc>
           <w:tcPr>
-            <w:tcW w:w="1923" w:type="dxa"/>
+            <w:tcW w:w="2019" w:type="dxa"/>
             <w:tcBorders/>
             <w:vAlign w:val="center"/>
           </w:tcPr>
@@ -3543,7 +3543,7 @@
         </w:trPr>
         <w:tc>
           <w:tcPr>
-            <w:tcW w:w="511" w:type="dxa"/>
+            <w:tcW w:w="494" w:type="dxa"/>
             <w:tcBorders/>
             <w:vAlign w:val="center"/>
           </w:tcPr>
@@ -3561,7 +3561,7 @@
         </w:tc>
         <w:tc>
           <w:tcPr>
-            <w:tcW w:w="3119" w:type="dxa"/>
+            <w:tcW w:w="3311" w:type="dxa"/>
             <w:tcBorders/>
             <w:vAlign w:val="center"/>
           </w:tcPr>
@@ -3579,7 +3579,7 @@
         </w:tc>
         <w:tc>
           <w:tcPr>
-            <w:tcW w:w="1923" w:type="dxa"/>
+            <w:tcW w:w="2019" w:type="dxa"/>
             <w:tcBorders/>
             <w:vAlign w:val="center"/>
           </w:tcPr>
@@ -3602,7 +3602,7 @@
         </w:trPr>
         <w:tc>
           <w:tcPr>
-            <w:tcW w:w="511" w:type="dxa"/>
+            <w:tcW w:w="494" w:type="dxa"/>
             <w:tcBorders/>
             <w:vAlign w:val="center"/>
           </w:tcPr>
@@ -3620,7 +3620,7 @@
         </w:tc>
         <w:tc>
           <w:tcPr>
-            <w:tcW w:w="3119" w:type="dxa"/>
+            <w:tcW w:w="3311" w:type="dxa"/>
             <w:tcBorders/>
             <w:vAlign w:val="center"/>
           </w:tcPr>
@@ -3638,7 +3638,7 @@
         </w:tc>
         <w:tc>
           <w:tcPr>
-            <w:tcW w:w="1923" w:type="dxa"/>
+            <w:tcW w:w="2019" w:type="dxa"/>
             <w:tcBorders/>
             <w:vAlign w:val="center"/>
           </w:tcPr>
@@ -3661,7 +3661,7 @@
         </w:trPr>
         <w:tc>
           <w:tcPr>
-            <w:tcW w:w="511" w:type="dxa"/>
+            <w:tcW w:w="494" w:type="dxa"/>
             <w:tcBorders/>
             <w:vAlign w:val="center"/>
           </w:tcPr>
@@ -3679,7 +3679,7 @@
         </w:tc>
         <w:tc>
           <w:tcPr>
-            <w:tcW w:w="3119" w:type="dxa"/>
+            <w:tcW w:w="3311" w:type="dxa"/>
             <w:tcBorders/>
             <w:vAlign w:val="center"/>
           </w:tcPr>
@@ -3697,7 +3697,7 @@
         </w:tc>
         <w:tc>
           <w:tcPr>
-            <w:tcW w:w="1923" w:type="dxa"/>
+            <w:tcW w:w="2019" w:type="dxa"/>
             <w:tcBorders/>
             <w:vAlign w:val="center"/>
           </w:tcPr>
@@ -3720,7 +3720,7 @@
         </w:trPr>
         <w:tc>
           <w:tcPr>
-            <w:tcW w:w="511" w:type="dxa"/>
+            <w:tcW w:w="494" w:type="dxa"/>
             <w:tcBorders/>
             <w:vAlign w:val="center"/>
           </w:tcPr>
@@ -3738,7 +3738,7 @@
         </w:tc>
         <w:tc>
           <w:tcPr>
-            <w:tcW w:w="3119" w:type="dxa"/>
+            <w:tcW w:w="3311" w:type="dxa"/>
             <w:tcBorders/>
             <w:vAlign w:val="center"/>
           </w:tcPr>
@@ -3756,7 +3756,7 @@
         </w:tc>
         <w:tc>
           <w:tcPr>
-            <w:tcW w:w="1923" w:type="dxa"/>
+            <w:tcW w:w="2019" w:type="dxa"/>
             <w:tcBorders/>
             <w:vAlign w:val="center"/>
           </w:tcPr>
@@ -3779,7 +3779,7 @@
         </w:trPr>
         <w:tc>
           <w:tcPr>
-            <w:tcW w:w="511" w:type="dxa"/>
+            <w:tcW w:w="494" w:type="dxa"/>
             <w:tcBorders>
               <w:bottom w:val="single" w:sz="8" w:space="0" w:color="auto"/>
             </w:tcBorders>
@@ -3798,7 +3798,7 @@
         </w:tc>
         <w:tc>
           <w:tcPr>
-            <w:tcW w:w="3119" w:type="dxa"/>
+            <w:tcW w:w="3311" w:type="dxa"/>
             <w:tcBorders>
               <w:bottom w:val="single" w:sz="8" w:space="0" w:color="auto"/>
             </w:tcBorders>
@@ -3817,7 +3817,7 @@
         </w:tc>
         <w:tc>
           <w:tcPr>
-            <w:tcW w:w="1923" w:type="dxa"/>
+            <w:tcW w:w="2019" w:type="dxa"/>
             <w:tcBorders>
               <w:bottom w:val="single" w:sz="8" w:space="0" w:color="auto"/>
             </w:tcBorders>
@@ -3846,7 +3846,7 @@
         <w:pStyle w:val="PPBodyMainText"/>
       </w:pPr>
       <w:r>
-        <w:t xml:space="preserve">Same-sex and opposite-sex spouses both map to husband/wife and both partner codes to unmarried partner. RELP 11 (roomer or boarder) has no successor, so it never occurs from 2019 onward. This removed category is itself a documented change that the localization can detect.</w:t>
+        <w:t xml:space="preserve">RELP 11 (roomer or boarder) has no successor, so it never occurs from 2019 on. The loss of this category is itself a documented change that the localization can pick up.</w:t>
       </w:r>
     </w:p>
     <w:p>
@@ -3865,7 +3865,7 @@
         <w:ind w:firstLine="0"/>
       </w:pPr>
       <w:r>
-        <w:t xml:space="preserve">Every stage of the pipeline writes its results to one file, which an interactive dashboard presents to the monitoring team. Fig. </w:t>
+        <w:t xml:space="preserve">A diagnosis is only useful if the team can read it. Every stage of the pipeline therefore writes its results to one file, which an interactive dashboard presents. Fig. </w:t>
       </w:r>
       <w:r>
         <w:t xml:space="preserve">S2</w:t>
@@ -3941,13 +3941,13 @@
         <w:pStyle w:val="PPBodyMainText"/>
       </w:pPr>
       <w:r>
-        <w:t xml:space="preserve">Panel (b) is the decision path of Fig. </w:t>
+        <w:t xml:space="preserve">Panel (b) applies the decision path of Fig. </w:t>
       </w:r>
       <w:r>
         <w:t xml:space="preserve">2</w:t>
       </w:r>
       <w:r>
-        <w:t xml:space="preserve"> applied to real windows. CA 2015 passes every label-free test. The audit then finds no significant accuracy drop, so the verdict is no drift. In CA 2016, CA 2018 and CA 2019 the predicted labels do not move, yet the feature tests reject and the shift survives the prior correction, so these windows are covariate shift. The remaining windows answer yes to every label-free question and are also covariate shift. Each view of the dashboard opens with the question it answers and ends with such a summary sentence, so a team can read the diagnosis without reading the code.</w:t>
+        <w:t xml:space="preserve"> to the real California (CA) windows. CA 2015 passes every label-free test. The audit then finds no significant drop in accuracy, so the verdict is no drift. In CA 2016, CA 2018 and CA 2019 the predicted labels stay where they were. The feature tests still reject and the shift survives the prior correction, so these windows are covariate shift. All other windows answer yes to every label-free question and are covariate shift as well. Each view of the dashboard opens with the question it answers and closes with a summary sentence of this kind, so a team can follow the diagnosis without reading the code.</w:t>
       </w:r>
     </w:p>
     <w:p>

</xml_diff>